<commit_message>
feat: remove OpenRouter prompt during install — defer to hermes setup
The OpenRouter API key prompt was the biggest UX friction point (account
creation, payment, key generation — 6 steps before the optional feature
even works). Now the installer stays focused on local setup only.

Changes:
- Removed configure_openrouter() call from main() flow
- Removed openrouter_key parameter from write_hermes_config() and print_next_steps()
- Updated next-steps output: 'Want cloud models? Run: hermes setup'
- Updated config.yaml comment to point to hermes setup
- Kept configure_openrouter() function for manual/programmatic use
- Updated MANUAL.md, QUICK-START.md, and both .docx files
</commit_message>
<xml_diff>
--- a/MANUAL.docx
+++ b/MANUAL.docx
@@ -10,7 +10,7 @@
         <w:t xml:space="preserve">Hermes One-Click Installer — User Manual</w:t>
       </w:r>
     </w:p>
-    <w:bookmarkStart w:id="31" w:name="hermes-one-click-installer--user-manual"/>
+    <w:bookmarkStart w:id="28" w:name="hermes-one-click-installer--user-manual"/>
     <w:p>
       <w:pPr>
         <w:pStyle w:val="Heading1"/>
@@ -373,7 +373,7 @@
       </w:r>
     </w:p>
     <w:bookmarkEnd w:id="13"/>
-    <w:bookmarkStart w:id="17" w:name="step-3-run-the-installer"/>
+    <w:bookmarkStart w:id="14" w:name="step-3-run-the-installer"/>
     <w:p>
       <w:pPr>
         <w:pStyle w:val="Heading2"/>
@@ -763,46 +763,7 @@
                 <w:b/>
                 <w:bCs/>
               </w:rPr>
-              <w:t xml:space="preserve">6. Ask about OpenRouter</w:t>
-            </w:r>
-          </w:p>
-        </w:tc>
-        <w:tc>
-          <w:tcPr/>
-          <w:p>
-            <w:pPr>
-              <w:pStyle w:val="Compact"/>
-            </w:pPr>
-            <w:r>
-              <w:t xml:space="preserve">Optional — see below</w:t>
-            </w:r>
-          </w:p>
-        </w:tc>
-        <w:tc>
-          <w:tcPr/>
-          <w:p>
-            <w:pPr>
-              <w:pStyle w:val="Compact"/>
-            </w:pPr>
-            <w:r>
-              <w:t xml:space="preserve">10 seconds</w:t>
-            </w:r>
-          </w:p>
-        </w:tc>
-      </w:tr>
-      <w:tr>
-        <w:tc>
-          <w:tcPr/>
-          <w:p>
-            <w:pPr>
-              <w:pStyle w:val="Compact"/>
-            </w:pPr>
-            <w:r>
-              <w:rPr>
-                <w:b/>
-                <w:bCs/>
-              </w:rPr>
-              <w:t xml:space="preserve">7. Write config</w:t>
+              <w:t xml:space="preserve">6. Write config</w:t>
             </w:r>
           </w:p>
         </w:tc>
@@ -869,21 +830,12 @@
         <w:t xml:space="preserve">This is the slow part.</w:t>
       </w:r>
     </w:p>
-    <w:bookmarkStart w:id="15" w:name="the-openrouter-question"/>
-    <w:p>
-      <w:pPr>
-        <w:pStyle w:val="Heading3"/>
-      </w:pPr>
-      <w:r>
-        <w:t xml:space="preserve">The OpenRouter question</w:t>
-      </w:r>
-    </w:p>
-    <w:p>
-      <w:pPr>
-        <w:pStyle w:val="FirstParagraph"/>
-      </w:pPr>
-      <w:r>
-        <w:t xml:space="preserve">After the model downloads, you'll see:</w:t>
+    <w:p>
+      <w:pPr>
+        <w:pStyle w:val="BodyText"/>
+      </w:pPr>
+      <w:r>
+        <w:t xml:space="preserve">When it's done:</w:t>
       </w:r>
     </w:p>
     <w:p>
@@ -894,131 +846,58 @@
         <w:rPr>
           <w:rStyle w:val="VerbatimChar"/>
         </w:rPr>
-        <w:t xml:space="preserve">Add OpenRouter API key now? [y/N]:</w:t>
-      </w:r>
-    </w:p>
-    <w:p>
-      <w:pPr>
-        <w:pStyle w:val="Compact"/>
-        <w:numPr>
-          <w:ilvl w:val="0"/>
-          <w:numId w:val="1003"/>
-        </w:numPr>
-      </w:pPr>
-      <w:r>
-        <w:rPr>
-          <w:b/>
-          <w:bCs/>
-        </w:rPr>
-        <w:t xml:space="preserve">Type</w:t>
-      </w:r>
-      <w:r>
-        <w:rPr>
-          <w:b/>
-          <w:bCs/>
-        </w:rPr>
-        <w:t xml:space="preserve"> </w:t>
+        <w:t xml:space="preserve">✓ Hermes One-Click Installer finished successfully!</w:t>
+      </w:r>
+      <w:r>
+        <w:br/>
+      </w:r>
+      <w:r>
+        <w:br/>
       </w:r>
       <w:r>
         <w:rPr>
           <w:rStyle w:val="VerbatimChar"/>
-          <w:b/>
-          <w:bCs/>
-        </w:rPr>
-        <w:t xml:space="preserve">y</w:t>
-      </w:r>
-      <w:r>
-        <w:t xml:space="preserve"> </w:t>
-      </w:r>
-      <w:r>
-        <w:t xml:space="preserve">and paste a key from</w:t>
-      </w:r>
-      <w:r>
-        <w:t xml:space="preserve"> </w:t>
-      </w:r>
-      <w:hyperlink r:id="rId14">
-        <w:r>
-          <w:rPr>
-            <w:rStyle w:val="Hyperlink"/>
-          </w:rPr>
-          <w:t xml:space="preserve">openrouter.ai/keys</w:t>
-        </w:r>
-      </w:hyperlink>
-      <w:r>
-        <w:t xml:space="preserve"> </w:t>
-      </w:r>
-      <w:r>
-        <w:t xml:space="preserve">→ gives your agent cloud fallback for hard tasks (Claude, GPT, etc.)</w:t>
-      </w:r>
-    </w:p>
-    <w:p>
-      <w:pPr>
-        <w:pStyle w:val="Compact"/>
-        <w:numPr>
-          <w:ilvl w:val="0"/>
-          <w:numId w:val="1003"/>
-        </w:numPr>
-      </w:pPr>
-      <w:r>
-        <w:rPr>
-          <w:b/>
-          <w:bCs/>
-        </w:rPr>
-        <w:t xml:space="preserve">Type</w:t>
-      </w:r>
-      <w:r>
-        <w:rPr>
-          <w:b/>
-          <w:bCs/>
-        </w:rPr>
-        <w:t xml:space="preserve"> </w:t>
+        </w:rPr>
+        <w:t xml:space="preserve">  Cloud:          Not configured (run 'hermes setup' to add)</w:t>
+      </w:r>
+      <w:r>
+        <w:br/>
+      </w:r>
+      <w:r>
+        <w:br/>
       </w:r>
       <w:r>
         <w:rPr>
           <w:rStyle w:val="VerbatimChar"/>
-          <w:b/>
-          <w:bCs/>
-        </w:rPr>
-        <w:t xml:space="preserve">N</w:t>
-      </w:r>
-      <w:r>
-        <w:t xml:space="preserve"> </w:t>
-      </w:r>
-      <w:r>
-        <w:t xml:space="preserve">or just press Enter → skip, everything still works locally. You can add it later.</w:t>
-      </w:r>
-    </w:p>
-    <w:bookmarkEnd w:id="15"/>
-    <w:bookmarkStart w:id="16" w:name="when-its-done"/>
-    <w:p>
-      <w:pPr>
-        <w:pStyle w:val="Heading3"/>
-      </w:pPr>
-      <w:r>
-        <w:t xml:space="preserve">When it's done</w:t>
-      </w:r>
-    </w:p>
-    <w:p>
-      <w:pPr>
-        <w:pStyle w:val="SourceCode"/>
-      </w:pPr>
+        </w:rPr>
+        <w:t xml:space="preserve">Next Steps:</w:t>
+      </w:r>
+      <w:r>
+        <w:br/>
+      </w:r>
       <w:r>
         <w:rPr>
           <w:rStyle w:val="VerbatimChar"/>
         </w:rPr>
-        <w:t xml:space="preserve">✓ Hermes One-Click Installer finished successfully!</w:t>
+        <w:t xml:space="preserve">  1. hermes              ← start chatting</w:t>
       </w:r>
       <w:r>
         <w:br/>
       </w:r>
       <w:r>
+        <w:rPr>
+          <w:rStyle w:val="VerbatimChar"/>
+        </w:rPr>
+        <w:t xml:space="preserve">  2. hermes setup        ← add cloud models (OpenRouter, OpenAI, Anthropic, etc.)</w:t>
+      </w:r>
+      <w:r>
         <w:br/>
       </w:r>
       <w:r>
         <w:rPr>
           <w:rStyle w:val="VerbatimChar"/>
         </w:rPr>
-        <w:t xml:space="preserve">Next Steps:</w:t>
+        <w:t xml:space="preserve">  3. hermes desktop      ← open desktop app</w:t>
       </w:r>
       <w:r>
         <w:br/>
@@ -1027,16 +906,19 @@
         <w:rPr>
           <w:rStyle w:val="VerbatimChar"/>
         </w:rPr>
-        <w:t xml:space="preserve">  1. hermes              ← start chatting</w:t>
+        <w:t xml:space="preserve">  4. hermes doctor       ← check everything works</w:t>
       </w:r>
       <w:r>
         <w:br/>
       </w:r>
       <w:r>
+        <w:br/>
+      </w:r>
+      <w:r>
         <w:rPr>
           <w:rStyle w:val="VerbatimChar"/>
         </w:rPr>
-        <w:t xml:space="preserve">  2. hermes setup        ← run setup wizard (recommended)</w:t>
+        <w:t xml:space="preserve">Want cloud models? Run:</w:t>
       </w:r>
       <w:r>
         <w:br/>
@@ -1045,21 +927,11 @@
         <w:rPr>
           <w:rStyle w:val="VerbatimChar"/>
         </w:rPr>
-        <w:t xml:space="preserve">  3. hermes desktop      ← open desktop app</w:t>
-      </w:r>
-      <w:r>
-        <w:br/>
-      </w:r>
-      <w:r>
-        <w:rPr>
-          <w:rStyle w:val="VerbatimChar"/>
-        </w:rPr>
-        <w:t xml:space="preserve">  4. hermes doctor       ← check everything works</w:t>
-      </w:r>
-    </w:p>
-    <w:bookmarkEnd w:id="16"/>
-    <w:bookmarkEnd w:id="17"/>
-    <w:bookmarkStart w:id="18" w:name="step-4-start-using-it"/>
+        <w:t xml:space="preserve">     hermes setup</w:t>
+      </w:r>
+    </w:p>
+    <w:bookmarkEnd w:id="14"/>
+    <w:bookmarkStart w:id="15" w:name="step-4-start-using-it"/>
     <w:p>
       <w:pPr>
         <w:pStyle w:val="Heading2"/>
@@ -1337,8 +1209,8 @@
         </w:pict>
       </w:r>
     </w:p>
-    <w:bookmarkEnd w:id="18"/>
-    <w:bookmarkStart w:id="27" w:name="if-something-goes-wrong-do-it-yourself"/>
+    <w:bookmarkEnd w:id="15"/>
+    <w:bookmarkStart w:id="24" w:name="if-something-goes-wrong-do-it-yourself"/>
     <w:p>
       <w:pPr>
         <w:pStyle w:val="Heading2"/>
@@ -1355,7 +1227,7 @@
         <w:t xml:space="preserve">The installer automates steps that you can also do manually. If it fails partway through, here's how to finish by hand:</w:t>
       </w:r>
     </w:p>
-    <w:bookmarkStart w:id="19" w:name="X25a4003322a55514303d12d418e3a4d11f95141"/>
+    <w:bookmarkStart w:id="16" w:name="X25a4003322a55514303d12d418e3a4d11f95141"/>
     <w:p>
       <w:pPr>
         <w:pStyle w:val="Heading3"/>
@@ -1427,8 +1299,8 @@
         <w:t xml:space="preserve">hermes --version</w:t>
       </w:r>
     </w:p>
-    <w:bookmarkEnd w:id="19"/>
-    <w:bookmarkStart w:id="21" w:name="X6184564eccfb96398cc512eb6ce7660808e794f"/>
+    <w:bookmarkEnd w:id="16"/>
+    <w:bookmarkStart w:id="18" w:name="X6184564eccfb96398cc512eb6ce7660808e794f"/>
     <w:p>
       <w:pPr>
         <w:pStyle w:val="Heading3"/>
@@ -1503,7 +1375,7 @@
       <w:r>
         <w:t xml:space="preserve"> </w:t>
       </w:r>
-      <w:hyperlink r:id="rId20">
+      <w:hyperlink r:id="rId17">
         <w:r>
           <w:rPr>
             <w:rStyle w:val="Hyperlink"/>
@@ -1512,8 +1384,8 @@
         </w:r>
       </w:hyperlink>
     </w:p>
-    <w:bookmarkEnd w:id="21"/>
-    <w:bookmarkStart w:id="22" w:name="X76076f545bb6672b9effb74ba71655830aa86cc"/>
+    <w:bookmarkEnd w:id="18"/>
+    <w:bookmarkStart w:id="19" w:name="X76076f545bb6672b9effb74ba71655830aa86cc"/>
     <w:p>
       <w:pPr>
         <w:pStyle w:val="Heading3"/>
@@ -1676,8 +1548,8 @@
         </w:tc>
       </w:tr>
     </w:tbl>
-    <w:bookmarkEnd w:id="22"/>
-    <w:bookmarkStart w:id="23" w:name="X859834a0cab58b31808fadce03d2993605adca2"/>
+    <w:bookmarkEnd w:id="19"/>
+    <w:bookmarkStart w:id="20" w:name="X859834a0cab58b31808fadce03d2993605adca2"/>
     <w:p>
       <w:pPr>
         <w:pStyle w:val="Heading3"/>
@@ -1721,8 +1593,8 @@
         <w:t xml:space="preserve">terminal window for the next steps.</w:t>
       </w:r>
     </w:p>
-    <w:bookmarkEnd w:id="23"/>
-    <w:bookmarkStart w:id="24" w:name="X30f5cf16a3bbc7e70706b59e2751dd42e32d50b"/>
+    <w:bookmarkEnd w:id="20"/>
+    <w:bookmarkStart w:id="21" w:name="X30f5cf16a3bbc7e70706b59e2751dd42e32d50b"/>
     <w:p>
       <w:pPr>
         <w:pStyle w:val="Heading3"/>
@@ -1992,14 +1864,22 @@
         <w:t xml:space="preserve"> http://localhost:11434/v1</w:t>
       </w:r>
     </w:p>
-    <w:bookmarkEnd w:id="24"/>
-    <w:bookmarkStart w:id="25" w:name="Xf2e92e75661e53ce7fbd48ee2daee8ca22b8a95"/>
+    <w:bookmarkEnd w:id="21"/>
+    <w:bookmarkStart w:id="22" w:name="Xee3fe7bdfd63fdbe8dd1dc359267b339a9dc78b"/>
     <w:p>
       <w:pPr>
         <w:pStyle w:val="Heading3"/>
       </w:pPr>
       <w:r>
-        <w:t xml:space="preserve">6. Add OpenRouter manually (optional)</w:t>
+        <w:t xml:space="preserve">6. Add cloud models (optional)</w:t>
+      </w:r>
+    </w:p>
+    <w:p>
+      <w:pPr>
+        <w:pStyle w:val="FirstParagraph"/>
+      </w:pPr>
+      <w:r>
+        <w:t xml:space="preserve">If you want cloud models alongside your local one:</w:t>
       </w:r>
     </w:p>
     <w:p>
@@ -2010,7 +1890,7 @@
         <w:rPr>
           <w:rStyle w:val="VerbatimChar"/>
         </w:rPr>
-        <w:t xml:space="preserve">hermes config set model.provider openrouter</w:t>
+        <w:t xml:space="preserve">hermes setup</w:t>
       </w:r>
     </w:p>
     <w:p>
@@ -2018,59 +1898,11 @@
         <w:pStyle w:val="FirstParagraph"/>
       </w:pPr>
       <w:r>
-        <w:t xml:space="preserve">Then edit</w:t>
-      </w:r>
-      <w:r>
-        <w:t xml:space="preserve"> </w:t>
-      </w:r>
-      <w:r>
-        <w:rPr>
-          <w:rStyle w:val="VerbatimChar"/>
-        </w:rPr>
-        <w:t xml:space="preserve">~/.hermes/.env</w:t>
-      </w:r>
-      <w:r>
-        <w:t xml:space="preserve"> </w:t>
-      </w:r>
-      <w:r>
-        <w:t xml:space="preserve">and add:</w:t>
-      </w:r>
-    </w:p>
-    <w:p>
-      <w:pPr>
-        <w:pStyle w:val="SourceCode"/>
-      </w:pPr>
-      <w:r>
-        <w:rPr>
-          <w:rStyle w:val="VerbatimChar"/>
-        </w:rPr>
-        <w:t xml:space="preserve">OPENROUTER_API_KEY=sk-or-your-key-here</w:t>
-      </w:r>
-    </w:p>
-    <w:p>
-      <w:pPr>
-        <w:pStyle w:val="FirstParagraph"/>
-      </w:pPr>
-      <w:r>
-        <w:t xml:space="preserve">Get a key at</w:t>
-      </w:r>
-      <w:r>
-        <w:t xml:space="preserve"> </w:t>
-      </w:r>
-      <w:hyperlink r:id="rId14">
-        <w:r>
-          <w:rPr>
-            <w:rStyle w:val="Hyperlink"/>
-          </w:rPr>
-          <w:t xml:space="preserve">openrouter.ai/keys</w:t>
-        </w:r>
-      </w:hyperlink>
-      <w:r>
-        <w:t xml:space="preserve">.</w:t>
-      </w:r>
-    </w:p>
-    <w:bookmarkEnd w:id="25"/>
-    <w:bookmarkStart w:id="26" w:name="X672a1f9aa1e32bf21757022815a61e585593417"/>
+        <w:t xml:space="preserve">This wizard supports OpenRouter, OpenAI, Anthropic, Google, and 20+ other providers. Pick one, paste your API key, done.</w:t>
+      </w:r>
+    </w:p>
+    <w:bookmarkEnd w:id="22"/>
+    <w:bookmarkStart w:id="23" w:name="X672a1f9aa1e32bf21757022815a61e585593417"/>
     <w:p>
       <w:pPr>
         <w:pStyle w:val="Heading3"/>
@@ -2105,9 +1937,9 @@
         </w:pict>
       </w:r>
     </w:p>
-    <w:bookmarkEnd w:id="26"/>
-    <w:bookmarkEnd w:id="27"/>
-    <w:bookmarkStart w:id="28" w:name="common-problems"/>
+    <w:bookmarkEnd w:id="23"/>
+    <w:bookmarkEnd w:id="24"/>
+    <w:bookmarkStart w:id="25" w:name="common-problems"/>
     <w:p>
       <w:pPr>
         <w:pStyle w:val="Heading2"/>
@@ -2448,8 +2280,8 @@
         </w:pict>
       </w:r>
     </w:p>
-    <w:bookmarkEnd w:id="28"/>
-    <w:bookmarkStart w:id="30" w:name="privacy"/>
+    <w:bookmarkEnd w:id="25"/>
+    <w:bookmarkStart w:id="27" w:name="privacy"/>
     <w:p>
       <w:pPr>
         <w:pStyle w:val="Heading2"/>
@@ -2463,7 +2295,7 @@
         <w:pStyle w:val="Compact"/>
         <w:numPr>
           <w:ilvl w:val="0"/>
-          <w:numId w:val="1004"/>
+          <w:numId w:val="1003"/>
         </w:numPr>
       </w:pPr>
       <w:r>
@@ -2491,7 +2323,7 @@
         <w:pStyle w:val="Compact"/>
         <w:numPr>
           <w:ilvl w:val="0"/>
-          <w:numId w:val="1004"/>
+          <w:numId w:val="1003"/>
         </w:numPr>
       </w:pPr>
       <w:r>
@@ -2503,7 +2335,7 @@
         <w:pStyle w:val="Compact"/>
         <w:numPr>
           <w:ilvl w:val="0"/>
-          <w:numId w:val="1004"/>
+          <w:numId w:val="1003"/>
         </w:numPr>
       </w:pPr>
       <w:r>
@@ -2515,7 +2347,7 @@
         <w:pStyle w:val="Compact"/>
         <w:numPr>
           <w:ilvl w:val="0"/>
-          <w:numId w:val="1004"/>
+          <w:numId w:val="1003"/>
         </w:numPr>
       </w:pPr>
       <w:r>
@@ -2593,7 +2425,7 @@
         </w:rPr>
         <w:t xml:space="preserve"> </w:t>
       </w:r>
-      <w:hyperlink r:id="rId29">
+      <w:hyperlink r:id="rId26">
         <w:r>
           <w:rPr>
             <w:rStyle w:val="Hyperlink"/>
@@ -2604,8 +2436,8 @@
         </w:r>
       </w:hyperlink>
     </w:p>
-    <w:bookmarkEnd w:id="30"/>
-    <w:bookmarkEnd w:id="31"/>
+    <w:bookmarkEnd w:id="27"/>
+    <w:bookmarkEnd w:id="28"/>
     <w:sectPr>
       <w:footnotePr>
         <w:numRestart w:val="eachSect"/>
@@ -2829,9 +2661,6 @@
     <w:abstractNumId w:val="991"/>
   </w:num>
   <w:num w:numId="1003">
-    <w:abstractNumId w:val="991"/>
-  </w:num>
-  <w:num w:numId="1004">
     <w:abstractNumId w:val="991"/>
   </w:num>
 </w:numbering>

</xml_diff>